<commit_message>
Done integrating Java and Ruby, all code execution works perfectly
</commit_message>
<xml_diff>
--- a/docs/KodxCamp-Project-Brief.docx
+++ b/docs/KodxCamp-Project-Brief.docx
@@ -544,30 +544,14 @@
           <w:rFonts w:ascii="Consolas" w:hAnsi="Consolas"/>
           <w:sz w:val="18"/>
         </w:rPr>
-        <w:t xml:space="preserve">     </w:t>
-      </w:r>
-      <w:proofErr w:type="gramStart"/>
-      <w:r>
-        <w:rPr>
-          <w:rFonts w:ascii="Consolas" w:hAnsi="Consolas"/>
-          <w:sz w:val="18"/>
-        </w:rPr>
-        <w:t xml:space="preserve"> </w:t>
-      </w:r>
-      <w:r>
-        <w:rPr>
-          <w:rFonts w:ascii="Consolas" w:hAnsi="Consolas"/>
-          <w:sz w:val="18"/>
-        </w:rPr>
-        <w:t xml:space="preserve"> .github</w:t>
-      </w:r>
-      <w:proofErr w:type="gramEnd"/>
-      <w:r>
-        <w:rPr>
-          <w:rFonts w:ascii="Consolas" w:hAnsi="Consolas"/>
-          <w:sz w:val="18"/>
-        </w:rPr>
-        <w:t>/      # CI workflow</w:t>
+        <w:t xml:space="preserve">      </w:t>
+      </w:r>
+      <w:r>
+        <w:rPr>
+          <w:rFonts w:ascii="Consolas" w:hAnsi="Consolas"/>
+          <w:sz w:val="18"/>
+        </w:rPr>
+        <w:t xml:space="preserve"> .github/      # CI workflow</w:t>
       </w:r>
       <w:r>
         <w:rPr>
@@ -588,17 +572,8 @@
           <w:rFonts w:ascii="Consolas" w:hAnsi="Consolas"/>
           <w:sz w:val="18"/>
         </w:rPr>
-        <w:t xml:space="preserve"> </w:t>
-      </w:r>
-      <w:proofErr w:type="gramStart"/>
-      <w:r>
-        <w:rPr>
-          <w:rFonts w:ascii="Consolas" w:hAnsi="Consolas"/>
-          <w:sz w:val="18"/>
-        </w:rPr>
-        <w:t>package.json</w:t>
-      </w:r>
-      <w:proofErr w:type="gramEnd"/>
+        <w:t xml:space="preserve"> package.json</w:t>
+      </w:r>
       <w:r>
         <w:rPr>
           <w:rFonts w:ascii="Consolas" w:hAnsi="Consolas"/>
@@ -618,17 +593,8 @@
           <w:rFonts w:ascii="Consolas" w:hAnsi="Consolas"/>
           <w:sz w:val="18"/>
         </w:rPr>
-        <w:t xml:space="preserve"> package-</w:t>
-      </w:r>
-      <w:proofErr w:type="gramStart"/>
-      <w:r>
-        <w:rPr>
-          <w:rFonts w:ascii="Consolas" w:hAnsi="Consolas"/>
-          <w:sz w:val="18"/>
-        </w:rPr>
-        <w:t>lock.json</w:t>
-      </w:r>
-      <w:proofErr w:type="gramEnd"/>
+        <w:t xml:space="preserve"> package-lock.json</w:t>
+      </w:r>
     </w:p>
     <w:p>
       <w:pPr>
@@ -1970,6 +1936,993 @@
     </w:p>
     <w:p>
       <w:pPr>
+        <w:rPr>
+          <w:b/>
+          <w:bCs/>
+          <w:lang w:val="en-IN"/>
+        </w:rPr>
+      </w:pPr>
+      <w:r>
+        <w:rPr>
+          <w:b/>
+          <w:bCs/>
+          <w:lang w:val="en-IN"/>
+        </w:rPr>
+        <w:t>4.3.1 Hidden Test Cases — Interim Client-Side Hashing (Not a Security Boundary)</w:t>
+      </w:r>
+    </w:p>
+    <w:p>
+      <w:pPr>
+        <w:rPr>
+          <w:lang w:val="en-IN"/>
+        </w:rPr>
+      </w:pPr>
+      <w:proofErr w:type="spellStart"/>
+      <w:r>
+        <w:rPr>
+          <w:lang w:val="en-IN"/>
+        </w:rPr>
+        <w:t>KodxCamp</w:t>
+      </w:r>
+      <w:proofErr w:type="spellEnd"/>
+      <w:r>
+        <w:rPr>
+          <w:lang w:val="en-IN"/>
+        </w:rPr>
+        <w:t xml:space="preserve"> currently runs all code in the browser. Problem and lesson test cases can be marked </w:t>
+      </w:r>
+      <w:proofErr w:type="spellStart"/>
+      <w:r>
+        <w:rPr>
+          <w:lang w:val="en-IN"/>
+        </w:rPr>
+        <w:t>isHidden</w:t>
+      </w:r>
+      <w:proofErr w:type="spellEnd"/>
+      <w:r>
+        <w:rPr>
+          <w:lang w:val="en-IN"/>
+        </w:rPr>
+        <w:t xml:space="preserve">. For hidden test cases, the platform stores only a </w:t>
+      </w:r>
+      <w:r>
+        <w:rPr>
+          <w:b/>
+          <w:bCs/>
+          <w:lang w:val="en-IN"/>
+        </w:rPr>
+        <w:t>SHA-256 hash of the canonicalized expected output</w:t>
+      </w:r>
+      <w:r>
+        <w:rPr>
+          <w:lang w:val="en-IN"/>
+        </w:rPr>
+        <w:t xml:space="preserve">, plus the hidden input. The student's output is hashed </w:t>
+      </w:r>
+      <w:r>
+        <w:rPr>
+          <w:b/>
+          <w:bCs/>
+          <w:lang w:val="en-IN"/>
+        </w:rPr>
+        <w:t>inside the same Worker that executes the code</w:t>
+      </w:r>
+      <w:r>
+        <w:rPr>
+          <w:lang w:val="en-IN"/>
+        </w:rPr>
+        <w:t xml:space="preserve">, and only a </w:t>
+      </w:r>
+      <w:proofErr w:type="spellStart"/>
+      <w:r>
+        <w:rPr>
+          <w:lang w:val="en-IN"/>
+        </w:rPr>
+        <w:t>boolean</w:t>
+      </w:r>
+      <w:proofErr w:type="spellEnd"/>
+      <w:r>
+        <w:rPr>
+          <w:lang w:val="en-IN"/>
+        </w:rPr>
+        <w:t xml:space="preserve"> passed flag is returned to the page-visible layer and forwarded to the server.</w:t>
+      </w:r>
+    </w:p>
+    <w:p>
+      <w:pPr>
+        <w:rPr>
+          <w:b/>
+          <w:bCs/>
+          <w:lang w:val="en-IN"/>
+        </w:rPr>
+      </w:pPr>
+      <w:r>
+        <w:rPr>
+          <w:b/>
+          <w:bCs/>
+          <w:lang w:val="en-IN"/>
+        </w:rPr>
+        <w:t>How it works</w:t>
+      </w:r>
+    </w:p>
+    <w:p>
+      <w:pPr>
+        <w:numPr>
+          <w:ilvl w:val="0"/>
+          <w:numId w:val="10"/>
+        </w:numPr>
+        <w:rPr>
+          <w:lang w:val="en-IN"/>
+        </w:rPr>
+      </w:pPr>
+      <w:r>
+        <w:rPr>
+          <w:b/>
+          <w:bCs/>
+          <w:lang w:val="en-IN"/>
+        </w:rPr>
+        <w:t>Authoring.</w:t>
+      </w:r>
+      <w:r>
+        <w:rPr>
+          <w:lang w:val="en-IN"/>
+        </w:rPr>
+        <w:t xml:space="preserve"> When an admin or instructor saves a test case with </w:t>
+      </w:r>
+      <w:proofErr w:type="spellStart"/>
+      <w:r>
+        <w:rPr>
+          <w:lang w:val="en-IN"/>
+        </w:rPr>
+        <w:t>isHidden</w:t>
+      </w:r>
+      <w:proofErr w:type="spellEnd"/>
+      <w:r>
+        <w:rPr>
+          <w:lang w:val="en-IN"/>
+        </w:rPr>
+        <w:t>: true, the server hashes the plaintext expected output with SHA-256 and stores only the hash. The plaintext never reaches the database.</w:t>
+      </w:r>
+    </w:p>
+    <w:p>
+      <w:pPr>
+        <w:numPr>
+          <w:ilvl w:val="0"/>
+          <w:numId w:val="10"/>
+        </w:numPr>
+        <w:rPr>
+          <w:lang w:val="en-IN"/>
+        </w:rPr>
+      </w:pPr>
+      <w:r>
+        <w:rPr>
+          <w:b/>
+          <w:bCs/>
+          <w:lang w:val="en-IN"/>
+        </w:rPr>
+        <w:t>Delivery.</w:t>
+      </w:r>
+      <w:r>
+        <w:rPr>
+          <w:lang w:val="en-IN"/>
+        </w:rPr>
+        <w:t xml:space="preserve"> When a student opens a problem, the server sends the hidden test </w:t>
+      </w:r>
+      <w:r>
+        <w:rPr>
+          <w:i/>
+          <w:iCs/>
+          <w:lang w:val="en-IN"/>
+        </w:rPr>
+        <w:t>inputs</w:t>
+      </w:r>
+      <w:r>
+        <w:rPr>
+          <w:lang w:val="en-IN"/>
+        </w:rPr>
+        <w:t xml:space="preserve"> (the client needs them to run the code) and the hidden test </w:t>
+      </w:r>
+      <w:r>
+        <w:rPr>
+          <w:i/>
+          <w:iCs/>
+          <w:lang w:val="en-IN"/>
+        </w:rPr>
+        <w:t>hashes</w:t>
+      </w:r>
+      <w:r>
+        <w:rPr>
+          <w:lang w:val="en-IN"/>
+        </w:rPr>
+        <w:t>. The expected outputs are never sent.</w:t>
+      </w:r>
+    </w:p>
+    <w:p>
+      <w:pPr>
+        <w:numPr>
+          <w:ilvl w:val="0"/>
+          <w:numId w:val="10"/>
+        </w:numPr>
+        <w:rPr>
+          <w:lang w:val="en-IN"/>
+        </w:rPr>
+      </w:pPr>
+      <w:r>
+        <w:rPr>
+          <w:b/>
+          <w:bCs/>
+          <w:lang w:val="en-IN"/>
+        </w:rPr>
+        <w:t>Execution.</w:t>
+      </w:r>
+      <w:r>
+        <w:rPr>
+          <w:lang w:val="en-IN"/>
+        </w:rPr>
+        <w:t xml:space="preserve"> The client wraps the student's code with a driver that produces JSON-serialized output, sends the wrapped code and the hidden input to a Worker, and the Worker canonicalizes the </w:t>
+      </w:r>
+      <w:proofErr w:type="spellStart"/>
+      <w:r>
+        <w:rPr>
+          <w:lang w:val="en-IN"/>
+        </w:rPr>
+        <w:t>stdout</w:t>
+      </w:r>
+      <w:proofErr w:type="spellEnd"/>
+      <w:r>
+        <w:rPr>
+          <w:lang w:val="en-IN"/>
+        </w:rPr>
+        <w:t xml:space="preserve"> and hashes it. Only { id, passed } crosses the Worker boundary.</w:t>
+      </w:r>
+    </w:p>
+    <w:p>
+      <w:pPr>
+        <w:numPr>
+          <w:ilvl w:val="0"/>
+          <w:numId w:val="10"/>
+        </w:numPr>
+        <w:rPr>
+          <w:lang w:val="en-IN"/>
+        </w:rPr>
+      </w:pPr>
+      <w:r>
+        <w:rPr>
+          <w:b/>
+          <w:bCs/>
+          <w:lang w:val="en-IN"/>
+        </w:rPr>
+        <w:t>Comparison.</w:t>
+      </w:r>
+      <w:r>
+        <w:rPr>
+          <w:lang w:val="en-IN"/>
+        </w:rPr>
+        <w:t xml:space="preserve"> The Worker compares the computed hash against the server-supplied </w:t>
+      </w:r>
+      <w:proofErr w:type="spellStart"/>
+      <w:r>
+        <w:rPr>
+          <w:lang w:val="en-IN"/>
+        </w:rPr>
+        <w:t>expectedOutputHash</w:t>
+      </w:r>
+      <w:proofErr w:type="spellEnd"/>
+      <w:r>
+        <w:rPr>
+          <w:lang w:val="en-IN"/>
+        </w:rPr>
+        <w:t>. If they match, the test passed.</w:t>
+      </w:r>
+    </w:p>
+    <w:p>
+      <w:pPr>
+        <w:numPr>
+          <w:ilvl w:val="0"/>
+          <w:numId w:val="10"/>
+        </w:numPr>
+        <w:rPr>
+          <w:lang w:val="en-IN"/>
+        </w:rPr>
+      </w:pPr>
+      <w:r>
+        <w:rPr>
+          <w:b/>
+          <w:bCs/>
+          <w:lang w:val="en-IN"/>
+        </w:rPr>
+        <w:t>Reporting.</w:t>
+      </w:r>
+      <w:r>
+        <w:rPr>
+          <w:lang w:val="en-IN"/>
+        </w:rPr>
+        <w:t xml:space="preserve"> The client sends { id, passed } for each hidden test to the server. The submission payload contains only </w:t>
+      </w:r>
+      <w:proofErr w:type="spellStart"/>
+      <w:r>
+        <w:rPr>
+          <w:lang w:val="en-IN"/>
+        </w:rPr>
+        <w:t>booleans</w:t>
+      </w:r>
+      <w:proofErr w:type="spellEnd"/>
+      <w:r>
+        <w:rPr>
+          <w:lang w:val="en-IN"/>
+        </w:rPr>
+        <w:t xml:space="preserve"> for hidden tests — no </w:t>
+      </w:r>
+      <w:proofErr w:type="spellStart"/>
+      <w:r>
+        <w:rPr>
+          <w:lang w:val="en-IN"/>
+        </w:rPr>
+        <w:t>stdout</w:t>
+      </w:r>
+      <w:proofErr w:type="spellEnd"/>
+      <w:r>
+        <w:rPr>
+          <w:lang w:val="en-IN"/>
+        </w:rPr>
+        <w:t>, no expected output, no raw input echo.</w:t>
+      </w:r>
+    </w:p>
+    <w:p>
+      <w:pPr>
+        <w:numPr>
+          <w:ilvl w:val="0"/>
+          <w:numId w:val="10"/>
+        </w:numPr>
+        <w:rPr>
+          <w:lang w:val="en-IN"/>
+        </w:rPr>
+      </w:pPr>
+      <w:r>
+        <w:rPr>
+          <w:b/>
+          <w:bCs/>
+          <w:lang w:val="en-IN"/>
+        </w:rPr>
+        <w:lastRenderedPageBreak/>
+        <w:t>Validation.</w:t>
+      </w:r>
+      <w:r>
+        <w:rPr>
+          <w:lang w:val="en-IN"/>
+        </w:rPr>
+        <w:t xml:space="preserve"> The server verifies that the reported hidden result IDs match the problem's actual hidden tests (count and identity), rejects unknown keys in the payload via strict Zod schemas, and computes the final verdict.</w:t>
+      </w:r>
+    </w:p>
+    <w:p>
+      <w:pPr>
+        <w:rPr>
+          <w:b/>
+          <w:bCs/>
+          <w:lang w:val="en-IN"/>
+        </w:rPr>
+      </w:pPr>
+      <w:r>
+        <w:rPr>
+          <w:b/>
+          <w:bCs/>
+          <w:lang w:val="en-IN"/>
+        </w:rPr>
+        <w:t>Canonicalization</w:t>
+      </w:r>
+    </w:p>
+    <w:p>
+      <w:pPr>
+        <w:rPr>
+          <w:lang w:val="en-IN"/>
+        </w:rPr>
+      </w:pPr>
+      <w:r>
+        <w:rPr>
+          <w:lang w:val="en-IN"/>
+        </w:rPr>
+        <w:t>Client and server agree on a canonicalization rule before hashing. This normalizes line endings (\r\n → \n) and trims trailing whitespace and a single trailing newline. The canonicalization ID is stored alongside the hash so both sides use the same rule. All canonicalization logic lives in shared/</w:t>
+      </w:r>
+      <w:proofErr w:type="spellStart"/>
+      <w:r>
+        <w:rPr>
+          <w:lang w:val="en-IN"/>
+        </w:rPr>
+        <w:t>src</w:t>
+      </w:r>
+      <w:proofErr w:type="spellEnd"/>
+      <w:r>
+        <w:rPr>
+          <w:lang w:val="en-IN"/>
+        </w:rPr>
+        <w:t>/testcase/</w:t>
+      </w:r>
+      <w:proofErr w:type="spellStart"/>
+      <w:r>
+        <w:rPr>
+          <w:lang w:val="en-IN"/>
+        </w:rPr>
+        <w:t>canonicalize.ts</w:t>
+      </w:r>
+      <w:proofErr w:type="spellEnd"/>
+      <w:r>
+        <w:rPr>
+          <w:lang w:val="en-IN"/>
+        </w:rPr>
+        <w:t xml:space="preserve"> — a single source of truth imported by both packages.</w:t>
+      </w:r>
+    </w:p>
+    <w:p>
+      <w:pPr>
+        <w:rPr>
+          <w:b/>
+          <w:bCs/>
+          <w:lang w:val="en-IN"/>
+        </w:rPr>
+      </w:pPr>
+      <w:r>
+        <w:rPr>
+          <w:b/>
+          <w:bCs/>
+          <w:lang w:val="en-IN"/>
+        </w:rPr>
+        <w:t>Why no salt</w:t>
+      </w:r>
+    </w:p>
+    <w:p>
+      <w:pPr>
+        <w:rPr>
+          <w:lang w:val="en-IN"/>
+        </w:rPr>
+      </w:pPr>
+      <w:r>
+        <w:rPr>
+          <w:lang w:val="en-IN"/>
+        </w:rPr>
+        <w:t xml:space="preserve">An earlier design considered applying a per-session salt to defend against crowdsourced hash → output lookup tables. That design was abandoned because a client-side salt provides no benefit under the current constraint set. A salt is only meaningful if the server also applies it during verification, and the server cannot compute a salted hash without the plaintext expected output. Since storing the plaintext defeats the entire purpose, salt is deferred until server-side judging ships — at which point the salt will be applied </w:t>
+      </w:r>
+      <w:r>
+        <w:rPr>
+          <w:i/>
+          <w:iCs/>
+          <w:lang w:val="en-IN"/>
+        </w:rPr>
+        <w:t>inside the server</w:t>
+      </w:r>
+      <w:r>
+        <w:rPr>
+          <w:lang w:val="en-IN"/>
+        </w:rPr>
+        <w:t>, where it actually matters.</w:t>
+      </w:r>
+    </w:p>
+    <w:p>
+      <w:pPr>
+        <w:rPr>
+          <w:b/>
+          <w:bCs/>
+          <w:lang w:val="en-IN"/>
+        </w:rPr>
+      </w:pPr>
+      <w:r>
+        <w:rPr>
+          <w:b/>
+          <w:bCs/>
+          <w:lang w:val="en-IN"/>
+        </w:rPr>
+        <w:t>Attack surface this closes</w:t>
+      </w:r>
+    </w:p>
+    <w:p>
+      <w:pPr>
+        <w:numPr>
+          <w:ilvl w:val="0"/>
+          <w:numId w:val="11"/>
+        </w:numPr>
+        <w:rPr>
+          <w:lang w:val="en-IN"/>
+        </w:rPr>
+      </w:pPr>
+      <w:r>
+        <w:rPr>
+          <w:b/>
+          <w:bCs/>
+          <w:lang w:val="en-IN"/>
+        </w:rPr>
+        <w:t>Bundle inspection.</w:t>
+      </w:r>
+      <w:r>
+        <w:rPr>
+          <w:lang w:val="en-IN"/>
+        </w:rPr>
+        <w:t xml:space="preserve"> No hidden expected output is present in the JavaScript bundle.</w:t>
+      </w:r>
+    </w:p>
+    <w:p>
+      <w:pPr>
+        <w:numPr>
+          <w:ilvl w:val="0"/>
+          <w:numId w:val="11"/>
+        </w:numPr>
+        <w:rPr>
+          <w:lang w:val="en-IN"/>
+        </w:rPr>
+      </w:pPr>
+      <w:r>
+        <w:rPr>
+          <w:b/>
+          <w:bCs/>
+          <w:lang w:val="en-IN"/>
+        </w:rPr>
+        <w:t>Network inspection.</w:t>
+      </w:r>
+      <w:r>
+        <w:rPr>
+          <w:lang w:val="en-IN"/>
+        </w:rPr>
+        <w:t xml:space="preserve"> No hidden expected output travels in any HTTP response.</w:t>
+      </w:r>
+    </w:p>
+    <w:p>
+      <w:pPr>
+        <w:numPr>
+          <w:ilvl w:val="0"/>
+          <w:numId w:val="11"/>
+        </w:numPr>
+        <w:rPr>
+          <w:lang w:val="en-IN"/>
+        </w:rPr>
+      </w:pPr>
+      <w:r>
+        <w:rPr>
+          <w:b/>
+          <w:bCs/>
+          <w:lang w:val="en-IN"/>
+        </w:rPr>
+        <w:t>Visible-test fixture inspection.</w:t>
+      </w:r>
+      <w:r>
+        <w:rPr>
+          <w:lang w:val="en-IN"/>
+        </w:rPr>
+        <w:t xml:space="preserve"> Hidden inputs are separate from visible inputs; knowing the visible tests reveals nothing about hidden ones.</w:t>
+      </w:r>
+    </w:p>
+    <w:p>
+      <w:pPr>
+        <w:numPr>
+          <w:ilvl w:val="0"/>
+          <w:numId w:val="11"/>
+        </w:numPr>
+        <w:rPr>
+          <w:lang w:val="en-IN"/>
+        </w:rPr>
+      </w:pPr>
+      <w:r>
+        <w:rPr>
+          <w:b/>
+          <w:bCs/>
+          <w:lang w:val="en-IN"/>
+        </w:rPr>
+        <w:t>Casual copy-paste.</w:t>
+      </w:r>
+      <w:r>
+        <w:rPr>
+          <w:lang w:val="en-IN"/>
+        </w:rPr>
+        <w:t xml:space="preserve"> A student who finds a passing solution for one problem cannot look up what the hidden expected output is and hardcode it.</w:t>
+      </w:r>
+    </w:p>
+    <w:p>
+      <w:pPr>
+        <w:rPr>
+          <w:b/>
+          <w:bCs/>
+          <w:lang w:val="en-IN"/>
+        </w:rPr>
+      </w:pPr>
+      <w:r>
+        <w:rPr>
+          <w:b/>
+          <w:bCs/>
+          <w:lang w:val="en-IN"/>
+        </w:rPr>
+        <w:t>Attack surface this does not close</w:t>
+      </w:r>
+    </w:p>
+    <w:p>
+      <w:pPr>
+        <w:rPr>
+          <w:lang w:val="en-IN"/>
+        </w:rPr>
+      </w:pPr>
+      <w:r>
+        <w:rPr>
+          <w:lang w:val="en-IN"/>
+        </w:rPr>
+        <w:t xml:space="preserve">A determined student who controls </w:t>
+      </w:r>
+      <w:proofErr w:type="spellStart"/>
+      <w:r>
+        <w:rPr>
+          <w:lang w:val="en-IN"/>
+        </w:rPr>
+        <w:t>devtools</w:t>
+      </w:r>
+      <w:proofErr w:type="spellEnd"/>
+      <w:r>
+        <w:rPr>
+          <w:lang w:val="en-IN"/>
+        </w:rPr>
+        <w:t>, the Worker, memory, and the execution environment can still:</w:t>
+      </w:r>
+    </w:p>
+    <w:p>
+      <w:pPr>
+        <w:numPr>
+          <w:ilvl w:val="0"/>
+          <w:numId w:val="12"/>
+        </w:numPr>
+        <w:rPr>
+          <w:lang w:val="en-IN"/>
+        </w:rPr>
+      </w:pPr>
+      <w:r>
+        <w:rPr>
+          <w:b/>
+          <w:bCs/>
+          <w:lang w:val="en-IN"/>
+        </w:rPr>
+        <w:t>Inspect the Worker's hashing and comparison logic.</w:t>
+      </w:r>
+      <w:r>
+        <w:rPr>
+          <w:lang w:val="en-IN"/>
+        </w:rPr>
+        <w:t xml:space="preserve"> The code is downloaded to the browser and can be read.</w:t>
+      </w:r>
+    </w:p>
+    <w:p>
+      <w:pPr>
+        <w:numPr>
+          <w:ilvl w:val="0"/>
+          <w:numId w:val="12"/>
+        </w:numPr>
+        <w:rPr>
+          <w:lang w:val="en-IN"/>
+        </w:rPr>
+      </w:pPr>
+      <w:r>
+        <w:rPr>
+          <w:b/>
+          <w:bCs/>
+          <w:lang w:val="en-IN"/>
+        </w:rPr>
+        <w:t>Intercept the raw output before it is hashed.</w:t>
+      </w:r>
+      <w:r>
+        <w:rPr>
+          <w:lang w:val="en-IN"/>
+        </w:rPr>
+        <w:t xml:space="preserve"> A modified Worker or a breakpoint in </w:t>
+      </w:r>
+      <w:proofErr w:type="spellStart"/>
+      <w:r>
+        <w:rPr>
+          <w:lang w:val="en-IN"/>
+        </w:rPr>
+        <w:t>devtools</w:t>
+      </w:r>
+      <w:proofErr w:type="spellEnd"/>
+      <w:r>
+        <w:rPr>
+          <w:lang w:val="en-IN"/>
+        </w:rPr>
+        <w:t xml:space="preserve"> reveals the student's own output before hashing.</w:t>
+      </w:r>
+    </w:p>
+    <w:p>
+      <w:pPr>
+        <w:numPr>
+          <w:ilvl w:val="0"/>
+          <w:numId w:val="12"/>
+        </w:numPr>
+        <w:rPr>
+          <w:lang w:val="en-IN"/>
+        </w:rPr>
+      </w:pPr>
+      <w:r>
+        <w:rPr>
+          <w:b/>
+          <w:bCs/>
+          <w:lang w:val="en-IN"/>
+        </w:rPr>
+        <w:t>Brute-force short or predictable expected outputs against the stored hash.</w:t>
+      </w:r>
+      <w:r>
+        <w:rPr>
+          <w:lang w:val="en-IN"/>
+        </w:rPr>
+        <w:t xml:space="preserve"> Because the hash is unsalted and deterministic, an attacker who obtains a hidden test's hash can try candidate outputs offline until one matches. This is the primary weakness of the current scheme. It matters most for short outputs (</w:t>
+      </w:r>
+      <w:proofErr w:type="spellStart"/>
+      <w:r>
+        <w:rPr>
+          <w:lang w:val="en-IN"/>
+        </w:rPr>
+        <w:t>booleans</w:t>
+      </w:r>
+      <w:proofErr w:type="spellEnd"/>
+      <w:r>
+        <w:rPr>
+          <w:lang w:val="en-IN"/>
+        </w:rPr>
+        <w:t>, single-digit numbers) and least for long structured outputs.</w:t>
+      </w:r>
+    </w:p>
+    <w:p>
+      <w:pPr>
+        <w:numPr>
+          <w:ilvl w:val="0"/>
+          <w:numId w:val="12"/>
+        </w:numPr>
+        <w:rPr>
+          <w:lang w:val="en-IN"/>
+        </w:rPr>
+      </w:pPr>
+      <w:r>
+        <w:rPr>
+          <w:b/>
+          <w:bCs/>
+          <w:lang w:val="en-IN"/>
+        </w:rPr>
+        <w:t>Replace the hashing function itself in a modified environment.</w:t>
+      </w:r>
+      <w:r>
+        <w:rPr>
+          <w:lang w:val="en-IN"/>
+        </w:rPr>
+        <w:t xml:space="preserve"> A student who edits the Worker's JavaScript can make every hidden test return passed: true.</w:t>
+      </w:r>
+    </w:p>
+    <w:p>
+      <w:pPr>
+        <w:numPr>
+          <w:ilvl w:val="0"/>
+          <w:numId w:val="12"/>
+        </w:numPr>
+        <w:rPr>
+          <w:lang w:val="en-IN"/>
+        </w:rPr>
+      </w:pPr>
+      <w:r>
+        <w:rPr>
+          <w:b/>
+          <w:bCs/>
+          <w:lang w:val="en-IN"/>
+        </w:rPr>
+        <w:t xml:space="preserve">Forge the </w:t>
+      </w:r>
+      <w:proofErr w:type="spellStart"/>
+      <w:r>
+        <w:rPr>
+          <w:b/>
+          <w:bCs/>
+          <w:lang w:val="en-IN"/>
+        </w:rPr>
+        <w:t>boolean</w:t>
+      </w:r>
+      <w:proofErr w:type="spellEnd"/>
+      <w:r>
+        <w:rPr>
+          <w:b/>
+          <w:bCs/>
+          <w:lang w:val="en-IN"/>
+        </w:rPr>
+        <w:t xml:space="preserve"> </w:t>
+      </w:r>
+      <w:r>
+        <w:rPr>
+          <w:lang w:val="en-IN"/>
+        </w:rPr>
+        <w:t>passed</w:t>
+      </w:r>
+      <w:r>
+        <w:rPr>
+          <w:b/>
+          <w:bCs/>
+          <w:lang w:val="en-IN"/>
+        </w:rPr>
+        <w:t xml:space="preserve"> flag sent to the server.</w:t>
+      </w:r>
+      <w:r>
+        <w:rPr>
+          <w:lang w:val="en-IN"/>
+        </w:rPr>
+        <w:t xml:space="preserve"> The server accepts the client's report as-is; it does not re-execute the code.</w:t>
+      </w:r>
+    </w:p>
+    <w:p>
+      <w:pPr>
+        <w:rPr>
+          <w:b/>
+          <w:bCs/>
+          <w:lang w:val="en-IN"/>
+        </w:rPr>
+      </w:pPr>
+      <w:r>
+        <w:rPr>
+          <w:b/>
+          <w:bCs/>
+          <w:lang w:val="en-IN"/>
+        </w:rPr>
+        <w:t>What closing these requires</w:t>
+      </w:r>
+    </w:p>
+    <w:p>
+      <w:pPr>
+        <w:rPr>
+          <w:lang w:val="en-IN"/>
+        </w:rPr>
+      </w:pPr>
+      <w:r>
+        <w:rPr>
+          <w:lang w:val="en-IN"/>
+        </w:rPr>
+        <w:lastRenderedPageBreak/>
+        <w:t xml:space="preserve">Server-side execution of untrusted code inside a hardened sandbox (Docker, </w:t>
+      </w:r>
+      <w:proofErr w:type="spellStart"/>
+      <w:r>
+        <w:rPr>
+          <w:lang w:val="en-IN"/>
+        </w:rPr>
+        <w:t>gVisor</w:t>
+      </w:r>
+      <w:proofErr w:type="spellEnd"/>
+      <w:r>
+        <w:rPr>
+          <w:lang w:val="en-IN"/>
+        </w:rPr>
+        <w:t xml:space="preserve">, Firecracker, or equivalent) with resource limits, network isolation, and server-held plaintext expected outputs. That work is tracked as </w:t>
+      </w:r>
+      <w:r>
+        <w:rPr>
+          <w:b/>
+          <w:bCs/>
+          <w:lang w:val="en-IN"/>
+        </w:rPr>
+        <w:t>"Secure server-side code judging"</w:t>
+      </w:r>
+      <w:r>
+        <w:rPr>
+          <w:lang w:val="en-IN"/>
+        </w:rPr>
+        <w:t xml:space="preserve"> in §9 (Constraints and Future Work) and §13 (Current Summary).</w:t>
+      </w:r>
+    </w:p>
+    <w:p>
+      <w:pPr>
+        <w:rPr>
+          <w:lang w:val="en-IN"/>
+        </w:rPr>
+      </w:pPr>
+      <w:r>
+        <w:rPr>
+          <w:lang w:val="en-IN"/>
+        </w:rPr>
+        <w:t xml:space="preserve">The hashing scheme described here is an </w:t>
+      </w:r>
+      <w:r>
+        <w:rPr>
+          <w:b/>
+          <w:bCs/>
+          <w:lang w:val="en-IN"/>
+        </w:rPr>
+        <w:t>interim mitigation</w:t>
+      </w:r>
+      <w:r>
+        <w:rPr>
+          <w:lang w:val="en-IN"/>
+        </w:rPr>
+        <w:t>. It is not a security boundary. It must not be presented as one, and it must be removed once server-side judging ships. Layering the two would be worse than either alone, because it would obscure which control is actually doing the work.</w:t>
+      </w:r>
+    </w:p>
+    <w:p>
+      <w:pPr>
+        <w:rPr>
+          <w:b/>
+          <w:bCs/>
+          <w:lang w:val="en-IN"/>
+        </w:rPr>
+      </w:pPr>
+      <w:r>
+        <w:rPr>
+          <w:b/>
+          <w:bCs/>
+          <w:lang w:val="en-IN"/>
+        </w:rPr>
+        <w:t>Structural limits</w:t>
+      </w:r>
+    </w:p>
+    <w:p>
+      <w:pPr>
+        <w:numPr>
+          <w:ilvl w:val="0"/>
+          <w:numId w:val="13"/>
+        </w:numPr>
+        <w:rPr>
+          <w:lang w:val="en-IN"/>
+        </w:rPr>
+      </w:pPr>
+      <w:r>
+        <w:rPr>
+          <w:b/>
+          <w:bCs/>
+          <w:lang w:val="en-IN"/>
+        </w:rPr>
+        <w:t>SQL and HTML hidden tests fail closed.</w:t>
+      </w:r>
+      <w:r>
+        <w:rPr>
+          <w:lang w:val="en-IN"/>
+        </w:rPr>
+        <w:t xml:space="preserve"> The SQL and HTML runners currently execute on the main thread, where hashing cannot be isolated from the page. Rather than ship a weaker guarantee for these languages, hidden tests for SQL and HTML return passed: false unconditionally until those runners are moved into Workers. No hidden tests are accepted for those languages today.</w:t>
+      </w:r>
+    </w:p>
+    <w:p>
+      <w:pPr>
+        <w:numPr>
+          <w:ilvl w:val="0"/>
+          <w:numId w:val="13"/>
+        </w:numPr>
+        <w:rPr>
+          <w:lang w:val="en-IN"/>
+        </w:rPr>
+      </w:pPr>
+      <w:r>
+        <w:rPr>
+          <w:b/>
+          <w:bCs/>
+          <w:lang w:val="en-IN"/>
+        </w:rPr>
+        <w:t>Hidden test inputs are delivered to the client.</w:t>
+      </w:r>
+      <w:r>
+        <w:rPr>
+          <w:lang w:val="en-IN"/>
+        </w:rPr>
+        <w:t xml:space="preserve"> This is unavoidable in a browser-only judge — the client must have the input to run the code. The security posture assumes the input is public; only the expected output is secret.</w:t>
+      </w:r>
+    </w:p>
+    <w:p>
+      <w:pPr>
+        <w:numPr>
+          <w:ilvl w:val="0"/>
+          <w:numId w:val="13"/>
+        </w:numPr>
+        <w:rPr>
+          <w:lang w:val="en-IN"/>
+        </w:rPr>
+      </w:pPr>
+      <w:r>
+        <w:rPr>
+          <w:b/>
+          <w:bCs/>
+          <w:lang w:val="en-IN"/>
+        </w:rPr>
+        <w:t>Admins cannot retrieve hidden expected outputs after saving.</w:t>
+      </w:r>
+      <w:r>
+        <w:rPr>
+          <w:lang w:val="en-IN"/>
+        </w:rPr>
+        <w:t xml:space="preserve"> Because only the hash is stored, the admin editor shows a blank expected-output field for hidden tests. Changing a hidden test's expected answer requires re-entering the plaintext.</w:t>
+      </w:r>
+    </w:p>
+    <w:p/>
+    <w:p>
+      <w:pPr>
         <w:pStyle w:val="Heading2"/>
       </w:pPr>
       <w:r>
@@ -2138,8 +3091,16 @@
         <w:pStyle w:val="ListBullet"/>
       </w:pPr>
       <w:r>
+        <w:t>Student enrollment and join/leave behavior.</w:t>
+      </w:r>
+    </w:p>
+    <w:p>
+      <w:pPr>
+        <w:pStyle w:val="ListBullet"/>
+      </w:pPr>
+      <w:r>
         <w:lastRenderedPageBreak/>
-        <w:t>Student enrollment and join/leave behavior.</w:t>
+        <w:t>Recording upload with Multer.</w:t>
       </w:r>
     </w:p>
     <w:p>
@@ -2147,7 +3108,7 @@
         <w:pStyle w:val="ListBullet"/>
       </w:pPr>
       <w:r>
-        <w:t>Recording upload with Multer.</w:t>
+        <w:t>Recording metadata and chapters.</w:t>
       </w:r>
     </w:p>
     <w:p>
@@ -2155,7 +3116,7 @@
         <w:pStyle w:val="ListBullet"/>
       </w:pPr>
       <w:r>
-        <w:t>Recording metadata and chapters.</w:t>
+        <w:t>Playback speed, resume position, progress tracking, and completion.</w:t>
       </w:r>
     </w:p>
     <w:p>
@@ -2163,7 +3124,7 @@
         <w:pStyle w:val="ListBullet"/>
       </w:pPr>
       <w:r>
-        <w:t>Playback speed, resume position, progress tracking, and completion.</w:t>
+        <w:t>Catch-up recordings view.</w:t>
       </w:r>
     </w:p>
     <w:p>
@@ -2171,7 +3132,7 @@
         <w:pStyle w:val="ListBullet"/>
       </w:pPr>
       <w:r>
-        <w:t>Catch-up recordings view.</w:t>
+        <w:t>HTTP range-compatible static video serving.</w:t>
       </w:r>
     </w:p>
     <w:p>
@@ -2179,7 +3140,20 @@
         <w:pStyle w:val="ListBullet"/>
       </w:pPr>
       <w:r>
-        <w:t>HTTP range-compatible static video serving.</w:t>
+        <w:t>Storage URL abstraction.</w:t>
+      </w:r>
+    </w:p>
+    <w:p>
+      <w:r>
+        <w:t>Recordings use local disk by default. Cloud storage provider integration is not implemented.</w:t>
+      </w:r>
+    </w:p>
+    <w:p>
+      <w:pPr>
+        <w:pStyle w:val="Heading2"/>
+      </w:pPr>
+      <w:r>
+        <w:t>4.7 Progress and Achievements</w:t>
       </w:r>
     </w:p>
     <w:p>
@@ -2187,12 +3161,47 @@
         <w:pStyle w:val="ListBullet"/>
       </w:pPr>
       <w:r>
-        <w:t>Storage URL abstraction.</w:t>
-      </w:r>
-    </w:p>
-    <w:p>
-      <w:r>
-        <w:t>Recordings use local disk by default. Cloud storage provider integration is not implemented.</w:t>
+        <w:t>Activity records and XP updates.</w:t>
+      </w:r>
+    </w:p>
+    <w:p>
+      <w:pPr>
+        <w:pStyle w:val="ListBullet"/>
+      </w:pPr>
+      <w:r>
+        <w:t>Course, problem, project, class, and recording activity.</w:t>
+      </w:r>
+    </w:p>
+    <w:p>
+      <w:pPr>
+        <w:pStyle w:val="ListBullet"/>
+      </w:pPr>
+      <w:r>
+        <w:t>Level calculation and streak tracking.</w:t>
+      </w:r>
+    </w:p>
+    <w:p>
+      <w:pPr>
+        <w:pStyle w:val="ListBullet"/>
+      </w:pPr>
+      <w:r>
+        <w:t>Achievement evaluation and idempotent user achievements.</w:t>
+      </w:r>
+    </w:p>
+    <w:p>
+      <w:pPr>
+        <w:pStyle w:val="ListBullet"/>
+      </w:pPr>
+      <w:r>
+        <w:t>Progress overview, weekly XP, difficulty breakdown, recent activity, course progress, and heatmap data.</w:t>
+      </w:r>
+    </w:p>
+    <w:p>
+      <w:pPr>
+        <w:pStyle w:val="ListBullet"/>
+      </w:pPr>
+      <w:r>
+        <w:t>Secret achievement display behavior.</w:t>
       </w:r>
     </w:p>
     <w:p>
@@ -2200,7 +3209,7 @@
         <w:pStyle w:val="Heading2"/>
       </w:pPr>
       <w:r>
-        <w:t>4.7 Progress and Achievements</w:t>
+        <w:t>4.8 Admin Panel</w:t>
       </w:r>
     </w:p>
     <w:p>
@@ -2208,7 +3217,7 @@
         <w:pStyle w:val="ListBullet"/>
       </w:pPr>
       <w:r>
-        <w:t>Activity records and XP updates.</w:t>
+        <w:t>Admin dashboard and platform statistics.</w:t>
       </w:r>
     </w:p>
     <w:p>
@@ -2216,7 +3225,7 @@
         <w:pStyle w:val="ListBullet"/>
       </w:pPr>
       <w:r>
-        <w:t>Course, problem, project, class, and recording activity.</w:t>
+        <w:t>User search, role management, and deletion.</w:t>
       </w:r>
     </w:p>
     <w:p>
@@ -2224,7 +3233,7 @@
         <w:pStyle w:val="ListBullet"/>
       </w:pPr>
       <w:r>
-        <w:t>Level calculation and streak tracking.</w:t>
+        <w:t>Problem CRUD and test-case editing.</w:t>
       </w:r>
     </w:p>
     <w:p>
@@ -2232,7 +3241,7 @@
         <w:pStyle w:val="ListBullet"/>
       </w:pPr>
       <w:r>
-        <w:t>Achievement evaluation and idempotent user achievements.</w:t>
+        <w:t>Project CRUD and metadata editing.</w:t>
       </w:r>
     </w:p>
     <w:p>
@@ -2240,7 +3249,7 @@
         <w:pStyle w:val="ListBullet"/>
       </w:pPr>
       <w:r>
-        <w:t>Progress overview, weekly XP, difficulty breakdown, recent activity, course progress, and heatmap data.</w:t>
+        <w:t>Class management.</w:t>
       </w:r>
     </w:p>
     <w:p>
@@ -2248,7 +3257,7 @@
         <w:pStyle w:val="ListBullet"/>
       </w:pPr>
       <w:r>
-        <w:t>Secret achievement display behavior.</w:t>
+        <w:t>Bulk import for problem, project, and course data.</w:t>
       </w:r>
     </w:p>
     <w:p>
@@ -2256,7 +3265,7 @@
         <w:pStyle w:val="Heading2"/>
       </w:pPr>
       <w:r>
-        <w:t>4.8 Admin Panel</w:t>
+        <w:t>4.9 Instructor Dashboard</w:t>
       </w:r>
     </w:p>
     <w:p>
@@ -2264,7 +3273,7 @@
         <w:pStyle w:val="ListBullet"/>
       </w:pPr>
       <w:r>
-        <w:t>Admin dashboard and platform statistics.</w:t>
+        <w:t>Instructor route guard and layout.</w:t>
       </w:r>
     </w:p>
     <w:p>
@@ -2272,7 +3281,7 @@
         <w:pStyle w:val="ListBullet"/>
       </w:pPr>
       <w:r>
-        <w:t>User search, role management, and deletion.</w:t>
+        <w:t>Instructor course list.</w:t>
       </w:r>
     </w:p>
     <w:p>
@@ -2280,7 +3289,7 @@
         <w:pStyle w:val="ListBullet"/>
       </w:pPr>
       <w:r>
-        <w:t>Problem CRUD and test-case editing.</w:t>
+        <w:t>Course editor.</w:t>
       </w:r>
     </w:p>
     <w:p>
@@ -2288,7 +3297,7 @@
         <w:pStyle w:val="ListBullet"/>
       </w:pPr>
       <w:r>
-        <w:t>Project CRUD and metadata editing.</w:t>
+        <w:t>Course team management.</w:t>
       </w:r>
     </w:p>
     <w:p>
@@ -2296,7 +3305,7 @@
         <w:pStyle w:val="ListBullet"/>
       </w:pPr>
       <w:r>
-        <w:t>Class management.</w:t>
+        <w:t>Team role changes.</w:t>
       </w:r>
     </w:p>
     <w:p>
@@ -2304,7 +3313,28 @@
         <w:pStyle w:val="ListBullet"/>
       </w:pPr>
       <w:r>
-        <w:t>Bulk import for problem, project, and course data.</w:t>
+        <w:t>Publish/unpublish controls.</w:t>
+      </w:r>
+    </w:p>
+    <w:p>
+      <w:pPr>
+        <w:pStyle w:val="ListBullet"/>
+      </w:pPr>
+      <w:r>
+        <w:t>Permission-aware course operations.</w:t>
+      </w:r>
+    </w:p>
+    <w:p>
+      <w:pPr>
+        <w:pStyle w:val="ListBullet"/>
+      </w:pPr>
+      <w:r>
+        <w:t>Course deletion permissions.</w:t>
+      </w:r>
+    </w:p>
+    <w:p>
+      <w:r>
+        <w:t>The Instructor Students page, instructor-wide student roster, course analytics, and content approval workflow are not implemented.</w:t>
       </w:r>
     </w:p>
     <w:p>
@@ -2312,7 +3342,7 @@
         <w:pStyle w:val="Heading2"/>
       </w:pPr>
       <w:r>
-        <w:t>4.9 Instructor Dashboard</w:t>
+        <w:t>4.10 Shared UI and UX</w:t>
       </w:r>
     </w:p>
     <w:p>
@@ -2320,7 +3350,7 @@
         <w:pStyle w:val="ListBullet"/>
       </w:pPr>
       <w:r>
-        <w:t>Instructor route guard and layout.</w:t>
+        <w:t>Toast notifications.</w:t>
       </w:r>
     </w:p>
     <w:p>
@@ -2328,7 +3358,7 @@
         <w:pStyle w:val="ListBullet"/>
       </w:pPr>
       <w:r>
-        <w:t>Instructor course list.</w:t>
+        <w:t>Error boundary and reusable error state.</w:t>
       </w:r>
     </w:p>
     <w:p>
@@ -2336,7 +3366,7 @@
         <w:pStyle w:val="ListBullet"/>
       </w:pPr>
       <w:r>
-        <w:t>Course editor.</w:t>
+        <w:t>Loading skeletons and spinners.</w:t>
       </w:r>
     </w:p>
     <w:p>
@@ -2344,7 +3374,7 @@
         <w:pStyle w:val="ListBullet"/>
       </w:pPr>
       <w:r>
-        <w:t>Course team management.</w:t>
+        <w:t>Branded 404 page.</w:t>
       </w:r>
     </w:p>
     <w:p>
@@ -2352,7 +3382,7 @@
         <w:pStyle w:val="ListBullet"/>
       </w:pPr>
       <w:r>
-        <w:t>Team role changes.</w:t>
+        <w:t>Responsive desktop/mobile navigation.</w:t>
       </w:r>
     </w:p>
     <w:p>
@@ -2360,7 +3390,7 @@
         <w:pStyle w:val="ListBullet"/>
       </w:pPr>
       <w:r>
-        <w:t>Publish/unpublish controls.</w:t>
+        <w:t>User menu.</w:t>
       </w:r>
     </w:p>
     <w:p>
@@ -2368,7 +3398,7 @@
         <w:pStyle w:val="ListBullet"/>
       </w:pPr>
       <w:r>
-        <w:t>Permission-aware course operations.</w:t>
+        <w:t>Light/dark theme toggle.</w:t>
       </w:r>
     </w:p>
     <w:p>
@@ -2376,20 +3406,7 @@
         <w:pStyle w:val="ListBullet"/>
       </w:pPr>
       <w:r>
-        <w:t>Course deletion permissions.</w:t>
-      </w:r>
-    </w:p>
-    <w:p>
-      <w:r>
-        <w:t>The Instructor Students page, instructor-wide student roster, course analytics, and content approval workflow are not implemented.</w:t>
-      </w:r>
-    </w:p>
-    <w:p>
-      <w:pPr>
-        <w:pStyle w:val="Heading2"/>
-      </w:pPr>
-      <w:r>
-        <w:t>4.10 Shared UI and UX</w:t>
+        <w:t>CSS design tokens.</w:t>
       </w:r>
     </w:p>
     <w:p>
@@ -2397,7 +3414,7 @@
         <w:pStyle w:val="ListBullet"/>
       </w:pPr>
       <w:r>
-        <w:t>Toast notifications.</w:t>
+        <w:t>SEO component support.</w:t>
       </w:r>
     </w:p>
     <w:p>
@@ -2405,71 +3422,7 @@
         <w:pStyle w:val="ListBullet"/>
       </w:pPr>
       <w:r>
-        <w:t>Error boundary and reusable error state.</w:t>
-      </w:r>
-    </w:p>
-    <w:p>
-      <w:pPr>
-        <w:pStyle w:val="ListBullet"/>
-      </w:pPr>
-      <w:r>
-        <w:t>Loading skeletons and spinners.</w:t>
-      </w:r>
-    </w:p>
-    <w:p>
-      <w:pPr>
-        <w:pStyle w:val="ListBullet"/>
-      </w:pPr>
-      <w:r>
-        <w:t>Branded 404 page.</w:t>
-      </w:r>
-    </w:p>
-    <w:p>
-      <w:pPr>
-        <w:pStyle w:val="ListBullet"/>
-      </w:pPr>
-      <w:r>
-        <w:t>Responsive desktop/mobile navigation.</w:t>
-      </w:r>
-    </w:p>
-    <w:p>
-      <w:pPr>
-        <w:pStyle w:val="ListBullet"/>
-      </w:pPr>
-      <w:r>
-        <w:t>User menu.</w:t>
-      </w:r>
-    </w:p>
-    <w:p>
-      <w:pPr>
-        <w:pStyle w:val="ListBullet"/>
-      </w:pPr>
-      <w:r>
-        <w:t>Light/dark theme toggle.</w:t>
-      </w:r>
-    </w:p>
-    <w:p>
-      <w:pPr>
-        <w:pStyle w:val="ListBullet"/>
-      </w:pPr>
-      <w:r>
-        <w:t>CSS design tokens.</w:t>
-      </w:r>
-    </w:p>
-    <w:p>
-      <w:pPr>
-        <w:pStyle w:val="ListBullet"/>
-      </w:pPr>
-      <w:r>
         <w:lastRenderedPageBreak/>
-        <w:t>SEO component support.</w:t>
-      </w:r>
-    </w:p>
-    <w:p>
-      <w:pPr>
-        <w:pStyle w:val="ListBullet"/>
-      </w:pPr>
-      <w:r>
         <w:t>Dialog focus handling and editor animations.</w:t>
       </w:r>
     </w:p>
@@ -2977,8 +3930,16 @@
         <w:pStyle w:val="ListBullet"/>
       </w:pPr>
       <w:r>
+        <w:t>Instructor student roster page.</w:t>
+      </w:r>
+    </w:p>
+    <w:p>
+      <w:pPr>
+        <w:pStyle w:val="ListBullet"/>
+      </w:pPr>
+      <w:r>
         <w:lastRenderedPageBreak/>
-        <w:t>Instructor student roster page.</w:t>
+        <w:t>Email invitations for course teams.</w:t>
       </w:r>
     </w:p>
     <w:p>
@@ -2986,7 +3947,7 @@
         <w:pStyle w:val="ListBullet"/>
       </w:pPr>
       <w:r>
-        <w:t>Email invitations for course teams.</w:t>
+        <w:t>Instructor course analytics.</w:t>
       </w:r>
     </w:p>
     <w:p>
@@ -2994,7 +3955,7 @@
         <w:pStyle w:val="ListBullet"/>
       </w:pPr>
       <w:r>
-        <w:t>Instructor course analytics.</w:t>
+        <w:t>Reviewer approval workflow.</w:t>
       </w:r>
     </w:p>
     <w:p>
@@ -3002,7 +3963,7 @@
         <w:pStyle w:val="ListBullet"/>
       </w:pPr>
       <w:r>
-        <w:t>Reviewer approval workflow.</w:t>
+        <w:t>Notifications and onboarding.</w:t>
       </w:r>
     </w:p>
     <w:p>
@@ -3010,7 +3971,7 @@
         <w:pStyle w:val="ListBullet"/>
       </w:pPr>
       <w:r>
-        <w:t>Notifications and onboarding.</w:t>
+        <w:t>Google Calendar integration.</w:t>
       </w:r>
     </w:p>
     <w:p>
@@ -3018,7 +3979,7 @@
         <w:pStyle w:val="ListBullet"/>
       </w:pPr>
       <w:r>
-        <w:t>Google Calendar integration.</w:t>
+        <w:t>Cloudinary/B2 provider implementation.</w:t>
       </w:r>
     </w:p>
     <w:p>
@@ -3026,7 +3987,7 @@
         <w:pStyle w:val="ListBullet"/>
       </w:pPr>
       <w:r>
-        <w:t>Cloudinary/B2 provider implementation.</w:t>
+        <w:t>Docker-based sandboxing and plagiarism detection.</w:t>
       </w:r>
     </w:p>
     <w:p>
@@ -3034,7 +3995,7 @@
         <w:pStyle w:val="ListBullet"/>
       </w:pPr>
       <w:r>
-        <w:t>Docker-based sandboxing and plagiarism detection.</w:t>
+        <w:t>Mobile editor polish.</w:t>
       </w:r>
     </w:p>
     <w:p>
@@ -3042,7 +4003,7 @@
         <w:pStyle w:val="ListBullet"/>
       </w:pPr>
       <w:r>
-        <w:t>Mobile editor polish.</w:t>
+        <w:t>Centralization of level formulas in the shared package.</w:t>
       </w:r>
     </w:p>
     <w:p>
@@ -3050,7 +4011,7 @@
         <w:pStyle w:val="ListBullet"/>
       </w:pPr>
       <w:r>
-        <w:t>Centralization of level formulas in the shared package.</w:t>
+        <w:t>Reduction of current Vite chunk-size and auth-store import warnings.</w:t>
       </w:r>
     </w:p>
     <w:p>
@@ -3058,7 +4019,17 @@
         <w:pStyle w:val="ListBullet"/>
       </w:pPr>
       <w:r>
-        <w:t>Reduction of current Vite chunk-size and auth-store import warnings.</w:t>
+        <w:rPr>
+          <w:rStyle w:val="Strong"/>
+          <w:rFonts w:ascii="Segoe UI" w:hAnsi="Segoe UI" w:cs="Segoe UI"/>
+        </w:rPr>
+        <w:t>Remove the client-side hidden-test hashing scheme</w:t>
+      </w:r>
+      <w:r>
+        <w:t xml:space="preserve"> once server-side judging ships. The interim hashing in §4.3.1 is a stopgap, not a permanent layer</w:t>
+      </w:r>
+      <w:r>
+        <w:t>.</w:t>
       </w:r>
     </w:p>
     <w:p>
@@ -3569,6 +4540,19 @@
         <w:t>The project is currently buildable and structurally migrated. Production deployment, secure server-side judging, instructor roster/analytics, reviewer workflow, notifications, onboarding, and external recording storage remain future work.</w:t>
       </w:r>
     </w:p>
+    <w:p>
+      <w:r>
+        <w:t xml:space="preserve">Problem and lesson test cases can be marked </w:t>
+      </w:r>
+      <w:proofErr w:type="spellStart"/>
+      <w:r>
+        <w:t>isHidden</w:t>
+      </w:r>
+      <w:proofErr w:type="spellEnd"/>
+      <w:r>
+        <w:t>; hidden expected outputs are stored as SHA-256 hashes and compared inside the browser Worker. This is an interim mitigation documented in §4.3.1 and must be removed when server-side judging ships.</w:t>
+      </w:r>
+    </w:p>
     <w:sectPr>
       <w:footerReference w:type="default" r:id="rId8"/>
       <w:pgSz w:w="12240" w:h="15840"/>
@@ -3819,6 +4803,715 @@
       </w:pPr>
       <w:rPr>
         <w:rFonts w:ascii="Symbol" w:hAnsi="Symbol" w:hint="default"/>
+      </w:rPr>
+    </w:lvl>
+  </w:abstractNum>
+  <w:abstractNum w:abstractNumId="9" w15:restartNumberingAfterBreak="0">
+    <w:nsid w:val="01331F63"/>
+    <w:multiLevelType w:val="multilevel"/>
+    <w:tmpl w:val="A67A16A4"/>
+    <w:lvl w:ilvl="0">
+      <w:start w:val="1"/>
+      <w:numFmt w:val="decimal"/>
+      <w:lvlText w:val="%1."/>
+      <w:lvlJc w:val="left"/>
+      <w:pPr>
+        <w:tabs>
+          <w:tab w:val="num" w:pos="720"/>
+        </w:tabs>
+        <w:ind w:left="720" w:hanging="360"/>
+      </w:pPr>
+    </w:lvl>
+    <w:lvl w:ilvl="1" w:tentative="1">
+      <w:start w:val="1"/>
+      <w:numFmt w:val="decimal"/>
+      <w:lvlText w:val="%2."/>
+      <w:lvlJc w:val="left"/>
+      <w:pPr>
+        <w:tabs>
+          <w:tab w:val="num" w:pos="1440"/>
+        </w:tabs>
+        <w:ind w:left="1440" w:hanging="360"/>
+      </w:pPr>
+    </w:lvl>
+    <w:lvl w:ilvl="2" w:tentative="1">
+      <w:start w:val="1"/>
+      <w:numFmt w:val="decimal"/>
+      <w:lvlText w:val="%3."/>
+      <w:lvlJc w:val="left"/>
+      <w:pPr>
+        <w:tabs>
+          <w:tab w:val="num" w:pos="2160"/>
+        </w:tabs>
+        <w:ind w:left="2160" w:hanging="360"/>
+      </w:pPr>
+    </w:lvl>
+    <w:lvl w:ilvl="3" w:tentative="1">
+      <w:start w:val="1"/>
+      <w:numFmt w:val="decimal"/>
+      <w:lvlText w:val="%4."/>
+      <w:lvlJc w:val="left"/>
+      <w:pPr>
+        <w:tabs>
+          <w:tab w:val="num" w:pos="2880"/>
+        </w:tabs>
+        <w:ind w:left="2880" w:hanging="360"/>
+      </w:pPr>
+    </w:lvl>
+    <w:lvl w:ilvl="4" w:tentative="1">
+      <w:start w:val="1"/>
+      <w:numFmt w:val="decimal"/>
+      <w:lvlText w:val="%5."/>
+      <w:lvlJc w:val="left"/>
+      <w:pPr>
+        <w:tabs>
+          <w:tab w:val="num" w:pos="3600"/>
+        </w:tabs>
+        <w:ind w:left="3600" w:hanging="360"/>
+      </w:pPr>
+    </w:lvl>
+    <w:lvl w:ilvl="5" w:tentative="1">
+      <w:start w:val="1"/>
+      <w:numFmt w:val="decimal"/>
+      <w:lvlText w:val="%6."/>
+      <w:lvlJc w:val="left"/>
+      <w:pPr>
+        <w:tabs>
+          <w:tab w:val="num" w:pos="4320"/>
+        </w:tabs>
+        <w:ind w:left="4320" w:hanging="360"/>
+      </w:pPr>
+    </w:lvl>
+    <w:lvl w:ilvl="6" w:tentative="1">
+      <w:start w:val="1"/>
+      <w:numFmt w:val="decimal"/>
+      <w:lvlText w:val="%7."/>
+      <w:lvlJc w:val="left"/>
+      <w:pPr>
+        <w:tabs>
+          <w:tab w:val="num" w:pos="5040"/>
+        </w:tabs>
+        <w:ind w:left="5040" w:hanging="360"/>
+      </w:pPr>
+    </w:lvl>
+    <w:lvl w:ilvl="7" w:tentative="1">
+      <w:start w:val="1"/>
+      <w:numFmt w:val="decimal"/>
+      <w:lvlText w:val="%8."/>
+      <w:lvlJc w:val="left"/>
+      <w:pPr>
+        <w:tabs>
+          <w:tab w:val="num" w:pos="5760"/>
+        </w:tabs>
+        <w:ind w:left="5760" w:hanging="360"/>
+      </w:pPr>
+    </w:lvl>
+    <w:lvl w:ilvl="8" w:tentative="1">
+      <w:start w:val="1"/>
+      <w:numFmt w:val="decimal"/>
+      <w:lvlText w:val="%9."/>
+      <w:lvlJc w:val="left"/>
+      <w:pPr>
+        <w:tabs>
+          <w:tab w:val="num" w:pos="6480"/>
+        </w:tabs>
+        <w:ind w:left="6480" w:hanging="360"/>
+      </w:pPr>
+    </w:lvl>
+  </w:abstractNum>
+  <w:abstractNum w:abstractNumId="10" w15:restartNumberingAfterBreak="0">
+    <w:nsid w:val="0D727C42"/>
+    <w:multiLevelType w:val="multilevel"/>
+    <w:tmpl w:val="76EA6222"/>
+    <w:lvl w:ilvl="0">
+      <w:start w:val="1"/>
+      <w:numFmt w:val="bullet"/>
+      <w:lvlText w:val=""/>
+      <w:lvlJc w:val="left"/>
+      <w:pPr>
+        <w:tabs>
+          <w:tab w:val="num" w:pos="720"/>
+        </w:tabs>
+        <w:ind w:left="720" w:hanging="360"/>
+      </w:pPr>
+      <w:rPr>
+        <w:rFonts w:ascii="Symbol" w:hAnsi="Symbol" w:hint="default"/>
+        <w:sz w:val="20"/>
+      </w:rPr>
+    </w:lvl>
+    <w:lvl w:ilvl="1" w:tentative="1">
+      <w:start w:val="1"/>
+      <w:numFmt w:val="bullet"/>
+      <w:lvlText w:val="o"/>
+      <w:lvlJc w:val="left"/>
+      <w:pPr>
+        <w:tabs>
+          <w:tab w:val="num" w:pos="1440"/>
+        </w:tabs>
+        <w:ind w:left="1440" w:hanging="360"/>
+      </w:pPr>
+      <w:rPr>
+        <w:rFonts w:ascii="Courier New" w:hAnsi="Courier New" w:hint="default"/>
+        <w:sz w:val="20"/>
+      </w:rPr>
+    </w:lvl>
+    <w:lvl w:ilvl="2" w:tentative="1">
+      <w:start w:val="1"/>
+      <w:numFmt w:val="bullet"/>
+      <w:lvlText w:val=""/>
+      <w:lvlJc w:val="left"/>
+      <w:pPr>
+        <w:tabs>
+          <w:tab w:val="num" w:pos="2160"/>
+        </w:tabs>
+        <w:ind w:left="2160" w:hanging="360"/>
+      </w:pPr>
+      <w:rPr>
+        <w:rFonts w:ascii="Wingdings" w:hAnsi="Wingdings" w:hint="default"/>
+        <w:sz w:val="20"/>
+      </w:rPr>
+    </w:lvl>
+    <w:lvl w:ilvl="3" w:tentative="1">
+      <w:start w:val="1"/>
+      <w:numFmt w:val="bullet"/>
+      <w:lvlText w:val=""/>
+      <w:lvlJc w:val="left"/>
+      <w:pPr>
+        <w:tabs>
+          <w:tab w:val="num" w:pos="2880"/>
+        </w:tabs>
+        <w:ind w:left="2880" w:hanging="360"/>
+      </w:pPr>
+      <w:rPr>
+        <w:rFonts w:ascii="Wingdings" w:hAnsi="Wingdings" w:hint="default"/>
+        <w:sz w:val="20"/>
+      </w:rPr>
+    </w:lvl>
+    <w:lvl w:ilvl="4" w:tentative="1">
+      <w:start w:val="1"/>
+      <w:numFmt w:val="bullet"/>
+      <w:lvlText w:val=""/>
+      <w:lvlJc w:val="left"/>
+      <w:pPr>
+        <w:tabs>
+          <w:tab w:val="num" w:pos="3600"/>
+        </w:tabs>
+        <w:ind w:left="3600" w:hanging="360"/>
+      </w:pPr>
+      <w:rPr>
+        <w:rFonts w:ascii="Wingdings" w:hAnsi="Wingdings" w:hint="default"/>
+        <w:sz w:val="20"/>
+      </w:rPr>
+    </w:lvl>
+    <w:lvl w:ilvl="5" w:tentative="1">
+      <w:start w:val="1"/>
+      <w:numFmt w:val="bullet"/>
+      <w:lvlText w:val=""/>
+      <w:lvlJc w:val="left"/>
+      <w:pPr>
+        <w:tabs>
+          <w:tab w:val="num" w:pos="4320"/>
+        </w:tabs>
+        <w:ind w:left="4320" w:hanging="360"/>
+      </w:pPr>
+      <w:rPr>
+        <w:rFonts w:ascii="Wingdings" w:hAnsi="Wingdings" w:hint="default"/>
+        <w:sz w:val="20"/>
+      </w:rPr>
+    </w:lvl>
+    <w:lvl w:ilvl="6" w:tentative="1">
+      <w:start w:val="1"/>
+      <w:numFmt w:val="bullet"/>
+      <w:lvlText w:val=""/>
+      <w:lvlJc w:val="left"/>
+      <w:pPr>
+        <w:tabs>
+          <w:tab w:val="num" w:pos="5040"/>
+        </w:tabs>
+        <w:ind w:left="5040" w:hanging="360"/>
+      </w:pPr>
+      <w:rPr>
+        <w:rFonts w:ascii="Wingdings" w:hAnsi="Wingdings" w:hint="default"/>
+        <w:sz w:val="20"/>
+      </w:rPr>
+    </w:lvl>
+    <w:lvl w:ilvl="7" w:tentative="1">
+      <w:start w:val="1"/>
+      <w:numFmt w:val="bullet"/>
+      <w:lvlText w:val=""/>
+      <w:lvlJc w:val="left"/>
+      <w:pPr>
+        <w:tabs>
+          <w:tab w:val="num" w:pos="5760"/>
+        </w:tabs>
+        <w:ind w:left="5760" w:hanging="360"/>
+      </w:pPr>
+      <w:rPr>
+        <w:rFonts w:ascii="Wingdings" w:hAnsi="Wingdings" w:hint="default"/>
+        <w:sz w:val="20"/>
+      </w:rPr>
+    </w:lvl>
+    <w:lvl w:ilvl="8" w:tentative="1">
+      <w:start w:val="1"/>
+      <w:numFmt w:val="bullet"/>
+      <w:lvlText w:val=""/>
+      <w:lvlJc w:val="left"/>
+      <w:pPr>
+        <w:tabs>
+          <w:tab w:val="num" w:pos="6480"/>
+        </w:tabs>
+        <w:ind w:left="6480" w:hanging="360"/>
+      </w:pPr>
+      <w:rPr>
+        <w:rFonts w:ascii="Wingdings" w:hAnsi="Wingdings" w:hint="default"/>
+        <w:sz w:val="20"/>
+      </w:rPr>
+    </w:lvl>
+  </w:abstractNum>
+  <w:abstractNum w:abstractNumId="11" w15:restartNumberingAfterBreak="0">
+    <w:nsid w:val="30C36BB6"/>
+    <w:multiLevelType w:val="multilevel"/>
+    <w:tmpl w:val="DE3C3FE0"/>
+    <w:lvl w:ilvl="0">
+      <w:start w:val="1"/>
+      <w:numFmt w:val="bullet"/>
+      <w:lvlText w:val=""/>
+      <w:lvlJc w:val="left"/>
+      <w:pPr>
+        <w:tabs>
+          <w:tab w:val="num" w:pos="720"/>
+        </w:tabs>
+        <w:ind w:left="720" w:hanging="360"/>
+      </w:pPr>
+      <w:rPr>
+        <w:rFonts w:ascii="Symbol" w:hAnsi="Symbol" w:hint="default"/>
+        <w:sz w:val="20"/>
+      </w:rPr>
+    </w:lvl>
+    <w:lvl w:ilvl="1" w:tentative="1">
+      <w:start w:val="1"/>
+      <w:numFmt w:val="bullet"/>
+      <w:lvlText w:val="o"/>
+      <w:lvlJc w:val="left"/>
+      <w:pPr>
+        <w:tabs>
+          <w:tab w:val="num" w:pos="1440"/>
+        </w:tabs>
+        <w:ind w:left="1440" w:hanging="360"/>
+      </w:pPr>
+      <w:rPr>
+        <w:rFonts w:ascii="Courier New" w:hAnsi="Courier New" w:hint="default"/>
+        <w:sz w:val="20"/>
+      </w:rPr>
+    </w:lvl>
+    <w:lvl w:ilvl="2" w:tentative="1">
+      <w:start w:val="1"/>
+      <w:numFmt w:val="bullet"/>
+      <w:lvlText w:val=""/>
+      <w:lvlJc w:val="left"/>
+      <w:pPr>
+        <w:tabs>
+          <w:tab w:val="num" w:pos="2160"/>
+        </w:tabs>
+        <w:ind w:left="2160" w:hanging="360"/>
+      </w:pPr>
+      <w:rPr>
+        <w:rFonts w:ascii="Wingdings" w:hAnsi="Wingdings" w:hint="default"/>
+        <w:sz w:val="20"/>
+      </w:rPr>
+    </w:lvl>
+    <w:lvl w:ilvl="3" w:tentative="1">
+      <w:start w:val="1"/>
+      <w:numFmt w:val="bullet"/>
+      <w:lvlText w:val=""/>
+      <w:lvlJc w:val="left"/>
+      <w:pPr>
+        <w:tabs>
+          <w:tab w:val="num" w:pos="2880"/>
+        </w:tabs>
+        <w:ind w:left="2880" w:hanging="360"/>
+      </w:pPr>
+      <w:rPr>
+        <w:rFonts w:ascii="Wingdings" w:hAnsi="Wingdings" w:hint="default"/>
+        <w:sz w:val="20"/>
+      </w:rPr>
+    </w:lvl>
+    <w:lvl w:ilvl="4" w:tentative="1">
+      <w:start w:val="1"/>
+      <w:numFmt w:val="bullet"/>
+      <w:lvlText w:val=""/>
+      <w:lvlJc w:val="left"/>
+      <w:pPr>
+        <w:tabs>
+          <w:tab w:val="num" w:pos="3600"/>
+        </w:tabs>
+        <w:ind w:left="3600" w:hanging="360"/>
+      </w:pPr>
+      <w:rPr>
+        <w:rFonts w:ascii="Wingdings" w:hAnsi="Wingdings" w:hint="default"/>
+        <w:sz w:val="20"/>
+      </w:rPr>
+    </w:lvl>
+    <w:lvl w:ilvl="5" w:tentative="1">
+      <w:start w:val="1"/>
+      <w:numFmt w:val="bullet"/>
+      <w:lvlText w:val=""/>
+      <w:lvlJc w:val="left"/>
+      <w:pPr>
+        <w:tabs>
+          <w:tab w:val="num" w:pos="4320"/>
+        </w:tabs>
+        <w:ind w:left="4320" w:hanging="360"/>
+      </w:pPr>
+      <w:rPr>
+        <w:rFonts w:ascii="Wingdings" w:hAnsi="Wingdings" w:hint="default"/>
+        <w:sz w:val="20"/>
+      </w:rPr>
+    </w:lvl>
+    <w:lvl w:ilvl="6" w:tentative="1">
+      <w:start w:val="1"/>
+      <w:numFmt w:val="bullet"/>
+      <w:lvlText w:val=""/>
+      <w:lvlJc w:val="left"/>
+      <w:pPr>
+        <w:tabs>
+          <w:tab w:val="num" w:pos="5040"/>
+        </w:tabs>
+        <w:ind w:left="5040" w:hanging="360"/>
+      </w:pPr>
+      <w:rPr>
+        <w:rFonts w:ascii="Wingdings" w:hAnsi="Wingdings" w:hint="default"/>
+        <w:sz w:val="20"/>
+      </w:rPr>
+    </w:lvl>
+    <w:lvl w:ilvl="7" w:tentative="1">
+      <w:start w:val="1"/>
+      <w:numFmt w:val="bullet"/>
+      <w:lvlText w:val=""/>
+      <w:lvlJc w:val="left"/>
+      <w:pPr>
+        <w:tabs>
+          <w:tab w:val="num" w:pos="5760"/>
+        </w:tabs>
+        <w:ind w:left="5760" w:hanging="360"/>
+      </w:pPr>
+      <w:rPr>
+        <w:rFonts w:ascii="Wingdings" w:hAnsi="Wingdings" w:hint="default"/>
+        <w:sz w:val="20"/>
+      </w:rPr>
+    </w:lvl>
+    <w:lvl w:ilvl="8" w:tentative="1">
+      <w:start w:val="1"/>
+      <w:numFmt w:val="bullet"/>
+      <w:lvlText w:val=""/>
+      <w:lvlJc w:val="left"/>
+      <w:pPr>
+        <w:tabs>
+          <w:tab w:val="num" w:pos="6480"/>
+        </w:tabs>
+        <w:ind w:left="6480" w:hanging="360"/>
+      </w:pPr>
+      <w:rPr>
+        <w:rFonts w:ascii="Wingdings" w:hAnsi="Wingdings" w:hint="default"/>
+        <w:sz w:val="20"/>
+      </w:rPr>
+    </w:lvl>
+  </w:abstractNum>
+  <w:abstractNum w:abstractNumId="12" w15:restartNumberingAfterBreak="0">
+    <w:nsid w:val="54EC3348"/>
+    <w:multiLevelType w:val="multilevel"/>
+    <w:tmpl w:val="153AC268"/>
+    <w:lvl w:ilvl="0">
+      <w:start w:val="1"/>
+      <w:numFmt w:val="bullet"/>
+      <w:lvlText w:val=""/>
+      <w:lvlJc w:val="left"/>
+      <w:pPr>
+        <w:tabs>
+          <w:tab w:val="num" w:pos="720"/>
+        </w:tabs>
+        <w:ind w:left="720" w:hanging="360"/>
+      </w:pPr>
+      <w:rPr>
+        <w:rFonts w:ascii="Symbol" w:hAnsi="Symbol" w:hint="default"/>
+        <w:sz w:val="20"/>
+      </w:rPr>
+    </w:lvl>
+    <w:lvl w:ilvl="1" w:tentative="1">
+      <w:start w:val="1"/>
+      <w:numFmt w:val="bullet"/>
+      <w:lvlText w:val="o"/>
+      <w:lvlJc w:val="left"/>
+      <w:pPr>
+        <w:tabs>
+          <w:tab w:val="num" w:pos="1440"/>
+        </w:tabs>
+        <w:ind w:left="1440" w:hanging="360"/>
+      </w:pPr>
+      <w:rPr>
+        <w:rFonts w:ascii="Courier New" w:hAnsi="Courier New" w:hint="default"/>
+        <w:sz w:val="20"/>
+      </w:rPr>
+    </w:lvl>
+    <w:lvl w:ilvl="2" w:tentative="1">
+      <w:start w:val="1"/>
+      <w:numFmt w:val="bullet"/>
+      <w:lvlText w:val=""/>
+      <w:lvlJc w:val="left"/>
+      <w:pPr>
+        <w:tabs>
+          <w:tab w:val="num" w:pos="2160"/>
+        </w:tabs>
+        <w:ind w:left="2160" w:hanging="360"/>
+      </w:pPr>
+      <w:rPr>
+        <w:rFonts w:ascii="Wingdings" w:hAnsi="Wingdings" w:hint="default"/>
+        <w:sz w:val="20"/>
+      </w:rPr>
+    </w:lvl>
+    <w:lvl w:ilvl="3" w:tentative="1">
+      <w:start w:val="1"/>
+      <w:numFmt w:val="bullet"/>
+      <w:lvlText w:val=""/>
+      <w:lvlJc w:val="left"/>
+      <w:pPr>
+        <w:tabs>
+          <w:tab w:val="num" w:pos="2880"/>
+        </w:tabs>
+        <w:ind w:left="2880" w:hanging="360"/>
+      </w:pPr>
+      <w:rPr>
+        <w:rFonts w:ascii="Wingdings" w:hAnsi="Wingdings" w:hint="default"/>
+        <w:sz w:val="20"/>
+      </w:rPr>
+    </w:lvl>
+    <w:lvl w:ilvl="4" w:tentative="1">
+      <w:start w:val="1"/>
+      <w:numFmt w:val="bullet"/>
+      <w:lvlText w:val=""/>
+      <w:lvlJc w:val="left"/>
+      <w:pPr>
+        <w:tabs>
+          <w:tab w:val="num" w:pos="3600"/>
+        </w:tabs>
+        <w:ind w:left="3600" w:hanging="360"/>
+      </w:pPr>
+      <w:rPr>
+        <w:rFonts w:ascii="Wingdings" w:hAnsi="Wingdings" w:hint="default"/>
+        <w:sz w:val="20"/>
+      </w:rPr>
+    </w:lvl>
+    <w:lvl w:ilvl="5" w:tentative="1">
+      <w:start w:val="1"/>
+      <w:numFmt w:val="bullet"/>
+      <w:lvlText w:val=""/>
+      <w:lvlJc w:val="left"/>
+      <w:pPr>
+        <w:tabs>
+          <w:tab w:val="num" w:pos="4320"/>
+        </w:tabs>
+        <w:ind w:left="4320" w:hanging="360"/>
+      </w:pPr>
+      <w:rPr>
+        <w:rFonts w:ascii="Wingdings" w:hAnsi="Wingdings" w:hint="default"/>
+        <w:sz w:val="20"/>
+      </w:rPr>
+    </w:lvl>
+    <w:lvl w:ilvl="6" w:tentative="1">
+      <w:start w:val="1"/>
+      <w:numFmt w:val="bullet"/>
+      <w:lvlText w:val=""/>
+      <w:lvlJc w:val="left"/>
+      <w:pPr>
+        <w:tabs>
+          <w:tab w:val="num" w:pos="5040"/>
+        </w:tabs>
+        <w:ind w:left="5040" w:hanging="360"/>
+      </w:pPr>
+      <w:rPr>
+        <w:rFonts w:ascii="Wingdings" w:hAnsi="Wingdings" w:hint="default"/>
+        <w:sz w:val="20"/>
+      </w:rPr>
+    </w:lvl>
+    <w:lvl w:ilvl="7" w:tentative="1">
+      <w:start w:val="1"/>
+      <w:numFmt w:val="bullet"/>
+      <w:lvlText w:val=""/>
+      <w:lvlJc w:val="left"/>
+      <w:pPr>
+        <w:tabs>
+          <w:tab w:val="num" w:pos="5760"/>
+        </w:tabs>
+        <w:ind w:left="5760" w:hanging="360"/>
+      </w:pPr>
+      <w:rPr>
+        <w:rFonts w:ascii="Wingdings" w:hAnsi="Wingdings" w:hint="default"/>
+        <w:sz w:val="20"/>
+      </w:rPr>
+    </w:lvl>
+    <w:lvl w:ilvl="8" w:tentative="1">
+      <w:start w:val="1"/>
+      <w:numFmt w:val="bullet"/>
+      <w:lvlText w:val=""/>
+      <w:lvlJc w:val="left"/>
+      <w:pPr>
+        <w:tabs>
+          <w:tab w:val="num" w:pos="6480"/>
+        </w:tabs>
+        <w:ind w:left="6480" w:hanging="360"/>
+      </w:pPr>
+      <w:rPr>
+        <w:rFonts w:ascii="Wingdings" w:hAnsi="Wingdings" w:hint="default"/>
+        <w:sz w:val="20"/>
+      </w:rPr>
+    </w:lvl>
+  </w:abstractNum>
+  <w:abstractNum w:abstractNumId="13" w15:restartNumberingAfterBreak="0">
+    <w:nsid w:val="64BE18BA"/>
+    <w:multiLevelType w:val="multilevel"/>
+    <w:tmpl w:val="82C66322"/>
+    <w:lvl w:ilvl="0">
+      <w:start w:val="1"/>
+      <w:numFmt w:val="bullet"/>
+      <w:lvlText w:val=""/>
+      <w:lvlJc w:val="left"/>
+      <w:pPr>
+        <w:tabs>
+          <w:tab w:val="num" w:pos="720"/>
+        </w:tabs>
+        <w:ind w:left="720" w:hanging="360"/>
+      </w:pPr>
+      <w:rPr>
+        <w:rFonts w:ascii="Symbol" w:hAnsi="Symbol" w:hint="default"/>
+        <w:sz w:val="20"/>
+      </w:rPr>
+    </w:lvl>
+    <w:lvl w:ilvl="1" w:tentative="1">
+      <w:start w:val="1"/>
+      <w:numFmt w:val="bullet"/>
+      <w:lvlText w:val="o"/>
+      <w:lvlJc w:val="left"/>
+      <w:pPr>
+        <w:tabs>
+          <w:tab w:val="num" w:pos="1440"/>
+        </w:tabs>
+        <w:ind w:left="1440" w:hanging="360"/>
+      </w:pPr>
+      <w:rPr>
+        <w:rFonts w:ascii="Courier New" w:hAnsi="Courier New" w:hint="default"/>
+        <w:sz w:val="20"/>
+      </w:rPr>
+    </w:lvl>
+    <w:lvl w:ilvl="2" w:tentative="1">
+      <w:start w:val="1"/>
+      <w:numFmt w:val="bullet"/>
+      <w:lvlText w:val=""/>
+      <w:lvlJc w:val="left"/>
+      <w:pPr>
+        <w:tabs>
+          <w:tab w:val="num" w:pos="2160"/>
+        </w:tabs>
+        <w:ind w:left="2160" w:hanging="360"/>
+      </w:pPr>
+      <w:rPr>
+        <w:rFonts w:ascii="Wingdings" w:hAnsi="Wingdings" w:hint="default"/>
+        <w:sz w:val="20"/>
+      </w:rPr>
+    </w:lvl>
+    <w:lvl w:ilvl="3" w:tentative="1">
+      <w:start w:val="1"/>
+      <w:numFmt w:val="bullet"/>
+      <w:lvlText w:val=""/>
+      <w:lvlJc w:val="left"/>
+      <w:pPr>
+        <w:tabs>
+          <w:tab w:val="num" w:pos="2880"/>
+        </w:tabs>
+        <w:ind w:left="2880" w:hanging="360"/>
+      </w:pPr>
+      <w:rPr>
+        <w:rFonts w:ascii="Wingdings" w:hAnsi="Wingdings" w:hint="default"/>
+        <w:sz w:val="20"/>
+      </w:rPr>
+    </w:lvl>
+    <w:lvl w:ilvl="4" w:tentative="1">
+      <w:start w:val="1"/>
+      <w:numFmt w:val="bullet"/>
+      <w:lvlText w:val=""/>
+      <w:lvlJc w:val="left"/>
+      <w:pPr>
+        <w:tabs>
+          <w:tab w:val="num" w:pos="3600"/>
+        </w:tabs>
+        <w:ind w:left="3600" w:hanging="360"/>
+      </w:pPr>
+      <w:rPr>
+        <w:rFonts w:ascii="Wingdings" w:hAnsi="Wingdings" w:hint="default"/>
+        <w:sz w:val="20"/>
+      </w:rPr>
+    </w:lvl>
+    <w:lvl w:ilvl="5" w:tentative="1">
+      <w:start w:val="1"/>
+      <w:numFmt w:val="bullet"/>
+      <w:lvlText w:val=""/>
+      <w:lvlJc w:val="left"/>
+      <w:pPr>
+        <w:tabs>
+          <w:tab w:val="num" w:pos="4320"/>
+        </w:tabs>
+        <w:ind w:left="4320" w:hanging="360"/>
+      </w:pPr>
+      <w:rPr>
+        <w:rFonts w:ascii="Wingdings" w:hAnsi="Wingdings" w:hint="default"/>
+        <w:sz w:val="20"/>
+      </w:rPr>
+    </w:lvl>
+    <w:lvl w:ilvl="6" w:tentative="1">
+      <w:start w:val="1"/>
+      <w:numFmt w:val="bullet"/>
+      <w:lvlText w:val=""/>
+      <w:lvlJc w:val="left"/>
+      <w:pPr>
+        <w:tabs>
+          <w:tab w:val="num" w:pos="5040"/>
+        </w:tabs>
+        <w:ind w:left="5040" w:hanging="360"/>
+      </w:pPr>
+      <w:rPr>
+        <w:rFonts w:ascii="Wingdings" w:hAnsi="Wingdings" w:hint="default"/>
+        <w:sz w:val="20"/>
+      </w:rPr>
+    </w:lvl>
+    <w:lvl w:ilvl="7" w:tentative="1">
+      <w:start w:val="1"/>
+      <w:numFmt w:val="bullet"/>
+      <w:lvlText w:val=""/>
+      <w:lvlJc w:val="left"/>
+      <w:pPr>
+        <w:tabs>
+          <w:tab w:val="num" w:pos="5760"/>
+        </w:tabs>
+        <w:ind w:left="5760" w:hanging="360"/>
+      </w:pPr>
+      <w:rPr>
+        <w:rFonts w:ascii="Wingdings" w:hAnsi="Wingdings" w:hint="default"/>
+        <w:sz w:val="20"/>
+      </w:rPr>
+    </w:lvl>
+    <w:lvl w:ilvl="8" w:tentative="1">
+      <w:start w:val="1"/>
+      <w:numFmt w:val="bullet"/>
+      <w:lvlText w:val=""/>
+      <w:lvlJc w:val="left"/>
+      <w:pPr>
+        <w:tabs>
+          <w:tab w:val="num" w:pos="6480"/>
+        </w:tabs>
+        <w:ind w:left="6480" w:hanging="360"/>
+      </w:pPr>
+      <w:rPr>
+        <w:rFonts w:ascii="Wingdings" w:hAnsi="Wingdings" w:hint="default"/>
+        <w:sz w:val="20"/>
       </w:rPr>
     </w:lvl>
   </w:abstractNum>
@@ -3848,6 +5541,21 @@
   </w:num>
   <w:num w:numId="9" w16cid:durableId="2059359636">
     <w:abstractNumId w:val="0"/>
+  </w:num>
+  <w:num w:numId="10" w16cid:durableId="1985547823">
+    <w:abstractNumId w:val="9"/>
+  </w:num>
+  <w:num w:numId="11" w16cid:durableId="1329669519">
+    <w:abstractNumId w:val="12"/>
+  </w:num>
+  <w:num w:numId="12" w16cid:durableId="188879915">
+    <w:abstractNumId w:val="10"/>
+  </w:num>
+  <w:num w:numId="13" w16cid:durableId="985477024">
+    <w:abstractNumId w:val="13"/>
+  </w:num>
+  <w:num w:numId="14" w16cid:durableId="1643340765">
+    <w:abstractNumId w:val="11"/>
   </w:num>
 </w:numbering>
 </file>
@@ -4457,7 +6165,6 @@
   <w:style w:type="character" w:default="1" w:styleId="DefaultParagraphFont">
     <w:name w:val="Default Paragraph Font"/>
     <w:uiPriority w:val="1"/>
-    <w:semiHidden/>
     <w:unhideWhenUsed/>
   </w:style>
   <w:style w:type="table" w:default="1" w:styleId="TableNormal">
@@ -15234,6 +16941,20 @@
       </w:tcPr>
     </w:tblStylePr>
   </w:style>
+  <w:style w:type="paragraph" w:customStyle="1" w:styleId="ds-markdown-paragraph">
+    <w:name w:val="ds-markdown-paragraph"/>
+    <w:basedOn w:val="Normal"/>
+    <w:rsid w:val="009967E3"/>
+    <w:pPr>
+      <w:spacing w:before="100" w:beforeAutospacing="1" w:after="100" w:afterAutospacing="1" w:line="240" w:lineRule="auto"/>
+    </w:pPr>
+    <w:rPr>
+      <w:rFonts w:ascii="Times New Roman" w:eastAsia="Times New Roman" w:hAnsi="Times New Roman" w:cs="Times New Roman"/>
+      <w:sz w:val="24"/>
+      <w:szCs w:val="24"/>
+      <w:lang w:val="en-IN" w:eastAsia="en-IN" w:bidi="hi-IN"/>
+    </w:rPr>
+  </w:style>
 </w:styles>
 </file>
 

</xml_diff>